<commit_message>
Update Resume/CV to black-and-white, elaborate CV, past-tense roles
- Regenerate Resume (2 pages) and CV in black-and-white text, justified
- Elaborate CV: personal details, fuller role bullets, tools and soft skills
- Past tense for the MTN SA role on the site and in the documents
- Justify article prose on the site
</commit_message>
<xml_diff>
--- a/site/public/docs/Innocent_Onwukanjo_Resume.docx
+++ b/site/public/docs/Innocent_Onwukanjo_Resume.docx
@@ -11,7 +11,7 @@
           <w:rFonts w:ascii="Calibri" w:cs="Calibri" w:eastAsia="Calibri" w:hAnsi="Calibri"/>
           <w:b/>
           <w:bCs/>
-          <w:color w:val="145C40"/>
+          <w:color w:val="000000"/>
           <w:sz w:val="40"/>
           <w:szCs w:val="40"/>
         </w:rPr>
@@ -27,7 +27,7 @@
           <w:rFonts w:ascii="Calibri" w:cs="Calibri" w:eastAsia="Calibri" w:hAnsi="Calibri"/>
           <w:b/>
           <w:bCs/>
-          <w:color w:val="0E8A68"/>
+          <w:color w:val="1A1A1A"/>
           <w:sz w:val="22"/>
           <w:szCs w:val="22"/>
         </w:rPr>
@@ -41,7 +41,7 @@
       <w:r>
         <w:rPr>
           <w:rFonts w:ascii="Calibri" w:cs="Calibri" w:eastAsia="Calibri" w:hAnsi="Calibri"/>
-          <w:color w:val="51665A"/>
+          <w:color w:val="3F3F3F"/>
           <w:sz w:val="18"/>
           <w:szCs w:val="18"/>
         </w:rPr>
@@ -50,7 +50,7 @@
       <w:r>
         <w:rPr>
           <w:rFonts w:ascii="Calibri" w:cs="Calibri" w:eastAsia="Calibri" w:hAnsi="Calibri"/>
-          <w:color w:val="51665A"/>
+          <w:color w:val="3F3F3F"/>
           <w:sz w:val="18"/>
           <w:szCs w:val="18"/>
         </w:rPr>
@@ -59,7 +59,7 @@
       <w:r>
         <w:rPr>
           <w:rFonts w:ascii="Calibri" w:cs="Calibri" w:eastAsia="Calibri" w:hAnsi="Calibri"/>
-          <w:color w:val="51665A"/>
+          <w:color w:val="3F3F3F"/>
           <w:sz w:val="18"/>
           <w:szCs w:val="18"/>
         </w:rPr>
@@ -68,7 +68,7 @@
       <w:r>
         <w:rPr>
           <w:rFonts w:ascii="Calibri" w:cs="Calibri" w:eastAsia="Calibri" w:hAnsi="Calibri"/>
-          <w:color w:val="51665A"/>
+          <w:color w:val="3F3F3F"/>
           <w:sz w:val="18"/>
           <w:szCs w:val="18"/>
         </w:rPr>
@@ -77,7 +77,7 @@
       <w:r>
         <w:rPr>
           <w:rFonts w:ascii="Calibri" w:cs="Calibri" w:eastAsia="Calibri" w:hAnsi="Calibri"/>
-          <w:color w:val="51665A"/>
+          <w:color w:val="3F3F3F"/>
           <w:sz w:val="18"/>
           <w:szCs w:val="18"/>
         </w:rPr>
@@ -88,13 +88,14 @@
       <w:pPr>
         <w:spacing w:after="40"/>
       </w:pPr>
-      <w:hyperlink w:history="1" r:id="rIdf80r4rf3py0qjzf3zo_qf">
+      <w:hyperlink w:history="1" r:id="rIdhmnxex7wh-kdymyrzil51">
         <w:r>
           <w:rPr>
             <w:rFonts w:ascii="Calibri" w:cs="Calibri" w:eastAsia="Calibri" w:hAnsi="Calibri"/>
-            <w:color w:val="0E8A68"/>
+            <w:color w:val="000000"/>
             <w:sz w:val="18"/>
             <w:szCs w:val="18"/>
+            <w:u w:val="single"/>
           </w:rPr>
           <w:t xml:space="preserve">linkedin.com/in/innocent-onwukanjo-80591b160</w:t>
         </w:r>
@@ -102,19 +103,20 @@
       <w:r>
         <w:rPr>
           <w:rFonts w:ascii="Calibri" w:cs="Calibri" w:eastAsia="Calibri" w:hAnsi="Calibri"/>
-          <w:color w:val="51665A"/>
+          <w:color w:val="3F3F3F"/>
           <w:sz w:val="18"/>
           <w:szCs w:val="18"/>
         </w:rPr>
         <w:t xml:space="preserve">   |   </w:t>
       </w:r>
-      <w:hyperlink w:history="1" r:id="rIdrnt96tnlv9t1eti5i_jfg">
+      <w:hyperlink w:history="1" r:id="rIdefudeaei1_8ajav1j4azc">
         <w:r>
           <w:rPr>
             <w:rFonts w:ascii="Calibri" w:cs="Calibri" w:eastAsia="Calibri" w:hAnsi="Calibri"/>
-            <w:color w:val="0E8A68"/>
+            <w:color w:val="000000"/>
             <w:sz w:val="18"/>
             <w:szCs w:val="18"/>
+            <w:u w:val="single"/>
           </w:rPr>
           <w:t xml:space="preserve">credly.com/users/innocent-onwukanjo</w:t>
         </w:r>
@@ -122,19 +124,20 @@
       <w:r>
         <w:rPr>
           <w:rFonts w:ascii="Calibri" w:cs="Calibri" w:eastAsia="Calibri" w:hAnsi="Calibri"/>
-          <w:color w:val="51665A"/>
+          <w:color w:val="3F3F3F"/>
           <w:sz w:val="18"/>
           <w:szCs w:val="18"/>
         </w:rPr>
         <w:t xml:space="preserve">   |   </w:t>
       </w:r>
-      <w:hyperlink w:history="1" r:id="rIdkux1fa_jvgmm2bpyelnoq">
+      <w:hyperlink w:history="1" r:id="rIdfc_s-n_fltcelhumxz-38">
         <w:r>
           <w:rPr>
             <w:rFonts w:ascii="Calibri" w:cs="Calibri" w:eastAsia="Calibri" w:hAnsi="Calibri"/>
-            <w:color w:val="0E8A68"/>
+            <w:color w:val="000000"/>
             <w:sz w:val="18"/>
             <w:szCs w:val="18"/>
+            <w:u w:val="single"/>
           </w:rPr>
           <w:t xml:space="preserve">github.com/innocious</w:t>
         </w:r>
@@ -143,7 +146,7 @@
     <w:p>
       <w:pPr>
         <w:pBdr>
-          <w:bottom w:val="single" w:color="145C40" w:sz="6"/>
+          <w:bottom w:val="single" w:color="000000" w:sz="6"/>
         </w:pBdr>
         <w:spacing w:after="80"/>
       </w:pPr>
@@ -158,7 +161,7 @@
     <w:p>
       <w:pPr>
         <w:pBdr>
-          <w:bottom w:val="single" w:color="145C40" w:sz="6"/>
+          <w:bottom w:val="single" w:color="000000" w:sz="6"/>
         </w:pBdr>
         <w:spacing w:after="40" w:before="200"/>
       </w:pPr>
@@ -167,7 +170,7 @@
           <w:rFonts w:ascii="Calibri" w:cs="Calibri" w:eastAsia="Calibri" w:hAnsi="Calibri"/>
           <w:b/>
           <w:bCs/>
-          <w:color w:val="145C40"/>
+          <w:color w:val="000000"/>
           <w:spacing w:val="12"/>
           <w:sz w:val="21"/>
           <w:szCs w:val="21"/>
@@ -183,7 +186,7 @@
       <w:r>
         <w:rPr>
           <w:rFonts w:ascii="Calibri" w:cs="Calibri" w:eastAsia="Calibri" w:hAnsi="Calibri"/>
-          <w:color w:val="1A231C"/>
+          <w:color w:val="000000"/>
           <w:sz w:val="20"/>
           <w:szCs w:val="20"/>
         </w:rPr>
@@ -193,7 +196,7 @@
     <w:p>
       <w:pPr>
         <w:pBdr>
-          <w:bottom w:val="single" w:color="145C40" w:sz="6"/>
+          <w:bottom w:val="single" w:color="000000" w:sz="6"/>
         </w:pBdr>
         <w:spacing w:after="40" w:before="200"/>
       </w:pPr>
@@ -202,7 +205,7 @@
           <w:rFonts w:ascii="Calibri" w:cs="Calibri" w:eastAsia="Calibri" w:hAnsi="Calibri"/>
           <w:b/>
           <w:bCs/>
-          <w:color w:val="145C40"/>
+          <w:color w:val="000000"/>
           <w:spacing w:val="12"/>
           <w:sz w:val="21"/>
           <w:szCs w:val="21"/>
@@ -219,7 +222,7 @@
           <w:rFonts w:ascii="Calibri" w:cs="Calibri" w:eastAsia="Calibri" w:hAnsi="Calibri"/>
           <w:b/>
           <w:bCs/>
-          <w:color w:val="1A231C"/>
+          <w:color w:val="000000"/>
           <w:sz w:val="20"/>
           <w:szCs w:val="20"/>
         </w:rPr>
@@ -228,7 +231,7 @@
       <w:r>
         <w:rPr>
           <w:rFonts w:ascii="Calibri" w:cs="Calibri" w:eastAsia="Calibri" w:hAnsi="Calibri"/>
-          <w:color w:val="51665A"/>
+          <w:color w:val="3F3F3F"/>
           <w:sz w:val="20"/>
           <w:szCs w:val="20"/>
         </w:rPr>
@@ -244,7 +247,7 @@
           <w:rFonts w:ascii="Calibri" w:cs="Calibri" w:eastAsia="Calibri" w:hAnsi="Calibri"/>
           <w:b/>
           <w:bCs/>
-          <w:color w:val="1A231C"/>
+          <w:color w:val="000000"/>
           <w:sz w:val="20"/>
           <w:szCs w:val="20"/>
         </w:rPr>
@@ -253,7 +256,7 @@
       <w:r>
         <w:rPr>
           <w:rFonts w:ascii="Calibri" w:cs="Calibri" w:eastAsia="Calibri" w:hAnsi="Calibri"/>
-          <w:color w:val="51665A"/>
+          <w:color w:val="3F3F3F"/>
           <w:sz w:val="20"/>
           <w:szCs w:val="20"/>
         </w:rPr>
@@ -269,7 +272,7 @@
           <w:rFonts w:ascii="Calibri" w:cs="Calibri" w:eastAsia="Calibri" w:hAnsi="Calibri"/>
           <w:b/>
           <w:bCs/>
-          <w:color w:val="1A231C"/>
+          <w:color w:val="000000"/>
           <w:sz w:val="20"/>
           <w:szCs w:val="20"/>
         </w:rPr>
@@ -278,7 +281,7 @@
       <w:r>
         <w:rPr>
           <w:rFonts w:ascii="Calibri" w:cs="Calibri" w:eastAsia="Calibri" w:hAnsi="Calibri"/>
-          <w:color w:val="51665A"/>
+          <w:color w:val="3F3F3F"/>
           <w:sz w:val="20"/>
           <w:szCs w:val="20"/>
         </w:rPr>
@@ -294,7 +297,7 @@
           <w:rFonts w:ascii="Calibri" w:cs="Calibri" w:eastAsia="Calibri" w:hAnsi="Calibri"/>
           <w:b/>
           <w:bCs/>
-          <w:color w:val="1A231C"/>
+          <w:color w:val="000000"/>
           <w:sz w:val="20"/>
           <w:szCs w:val="20"/>
         </w:rPr>
@@ -303,7 +306,7 @@
       <w:r>
         <w:rPr>
           <w:rFonts w:ascii="Calibri" w:cs="Calibri" w:eastAsia="Calibri" w:hAnsi="Calibri"/>
-          <w:color w:val="51665A"/>
+          <w:color w:val="3F3F3F"/>
           <w:sz w:val="20"/>
           <w:szCs w:val="20"/>
         </w:rPr>
@@ -319,7 +322,7 @@
           <w:rFonts w:ascii="Calibri" w:cs="Calibri" w:eastAsia="Calibri" w:hAnsi="Calibri"/>
           <w:b/>
           <w:bCs/>
-          <w:color w:val="1A231C"/>
+          <w:color w:val="000000"/>
           <w:sz w:val="20"/>
           <w:szCs w:val="20"/>
         </w:rPr>
@@ -328,7 +331,7 @@
       <w:r>
         <w:rPr>
           <w:rFonts w:ascii="Calibri" w:cs="Calibri" w:eastAsia="Calibri" w:hAnsi="Calibri"/>
-          <w:color w:val="51665A"/>
+          <w:color w:val="3F3F3F"/>
           <w:sz w:val="20"/>
           <w:szCs w:val="20"/>
         </w:rPr>
@@ -344,7 +347,7 @@
           <w:rFonts w:ascii="Calibri" w:cs="Calibri" w:eastAsia="Calibri" w:hAnsi="Calibri"/>
           <w:b/>
           <w:bCs/>
-          <w:color w:val="1A231C"/>
+          <w:color w:val="000000"/>
           <w:sz w:val="20"/>
           <w:szCs w:val="20"/>
         </w:rPr>
@@ -353,7 +356,7 @@
       <w:r>
         <w:rPr>
           <w:rFonts w:ascii="Calibri" w:cs="Calibri" w:eastAsia="Calibri" w:hAnsi="Calibri"/>
-          <w:color w:val="51665A"/>
+          <w:color w:val="3F3F3F"/>
           <w:sz w:val="20"/>
           <w:szCs w:val="20"/>
         </w:rPr>
@@ -369,7 +372,7 @@
           <w:rFonts w:ascii="Calibri" w:cs="Calibri" w:eastAsia="Calibri" w:hAnsi="Calibri"/>
           <w:b/>
           <w:bCs/>
-          <w:color w:val="1A231C"/>
+          <w:color w:val="000000"/>
           <w:sz w:val="20"/>
           <w:szCs w:val="20"/>
         </w:rPr>
@@ -378,7 +381,7 @@
       <w:r>
         <w:rPr>
           <w:rFonts w:ascii="Calibri" w:cs="Calibri" w:eastAsia="Calibri" w:hAnsi="Calibri"/>
-          <w:color w:val="51665A"/>
+          <w:color w:val="3F3F3F"/>
           <w:sz w:val="20"/>
           <w:szCs w:val="20"/>
         </w:rPr>
@@ -388,7 +391,7 @@
     <w:p>
       <w:pPr>
         <w:pBdr>
-          <w:bottom w:val="single" w:color="145C40" w:sz="6"/>
+          <w:bottom w:val="single" w:color="000000" w:sz="6"/>
         </w:pBdr>
         <w:spacing w:after="40" w:before="200"/>
       </w:pPr>
@@ -397,7 +400,7 @@
           <w:rFonts w:ascii="Calibri" w:cs="Calibri" w:eastAsia="Calibri" w:hAnsi="Calibri"/>
           <w:b/>
           <w:bCs/>
-          <w:color w:val="145C40"/>
+          <w:color w:val="000000"/>
           <w:spacing w:val="12"/>
           <w:sz w:val="21"/>
           <w:szCs w:val="21"/>
@@ -407,29 +410,20 @@
     </w:p>
     <w:p>
       <w:pPr>
-        <w:spacing w:after="10" w:before="120"/>
-      </w:pPr>
-      <w:r>
-        <w:rPr>
-          <w:rFonts w:ascii="Calibri" w:cs="Calibri" w:eastAsia="Calibri" w:hAnsi="Calibri"/>
-          <w:b/>
-          <w:bCs/>
-          <w:color w:val="1A231C"/>
+        <w:spacing w:after="6" w:before="120"/>
+      </w:pPr>
+      <w:r>
+        <w:rPr>
+          <w:rFonts w:ascii="Calibri" w:cs="Calibri" w:eastAsia="Calibri" w:hAnsi="Calibri"/>
+          <w:b/>
+          <w:bCs/>
+          <w:color w:val="000000"/>
           <w:sz w:val="21"/>
           <w:szCs w:val="21"/>
         </w:rPr>
         <w:t xml:space="preserve">DevOps Engineer</w:t>
       </w:r>
       <w:r>
-        <w:rPr>
-          <w:rFonts w:ascii="Calibri" w:cs="Calibri" w:eastAsia="Calibri" w:hAnsi="Calibri"/>
-          <w:color w:val="0E8A68"/>
-          <w:sz w:val="20"/>
-          <w:szCs w:val="20"/>
-        </w:rPr>
-        <w:t xml:space="preserve">   Inhlelo Consultants · MTN South Africa (via iOCO)</w:t>
-      </w:r>
-      <w:r>
         <w:ptab w:alignment="right" w:relativeTo="margin" w:leader="none"/>
       </w:r>
       <w:r>
@@ -437,7 +431,7 @@
           <w:rFonts w:ascii="Calibri" w:cs="Calibri" w:eastAsia="Calibri" w:hAnsi="Calibri"/>
           <w:i/>
           <w:iCs/>
-          <w:color w:val="51665A"/>
+          <w:color w:val="3F3F3F"/>
           <w:sz w:val="18"/>
           <w:szCs w:val="18"/>
         </w:rPr>
@@ -446,36 +440,52 @@
     </w:p>
     <w:p>
       <w:pPr>
-        <w:pStyle w:val="ListParagraph"/>
-        <w:numPr>
-          <w:ilvl w:val="0"/>
-          <w:numId w:val="1"/>
-        </w:numPr>
-        <w:spacing w:after="30"/>
-      </w:pPr>
-      <w:r>
-        <w:rPr>
-          <w:rFonts w:ascii="Calibri" w:cs="Calibri" w:eastAsia="Calibri" w:hAnsi="Calibri"/>
-          <w:color w:val="1A231C"/>
-          <w:sz w:val="20"/>
-          <w:szCs w:val="20"/>
-        </w:rPr>
-        <w:t xml:space="preserve">Delivered CI/CD and cloud automation for the MTN SA NextGen App with the iOCO client team; served as on-call DevOps support.</w:t>
-      </w:r>
-    </w:p>
-    <w:p>
-      <w:pPr>
-        <w:pStyle w:val="ListParagraph"/>
-        <w:numPr>
-          <w:ilvl w:val="0"/>
-          <w:numId w:val="1"/>
-        </w:numPr>
-        <w:spacing w:after="30"/>
-      </w:pPr>
-      <w:r>
-        <w:rPr>
-          <w:rFonts w:ascii="Calibri" w:cs="Calibri" w:eastAsia="Calibri" w:hAnsi="Calibri"/>
-          <w:color w:val="1A231C"/>
+        <w:spacing w:after="10"/>
+      </w:pPr>
+      <w:r>
+        <w:rPr>
+          <w:rFonts w:ascii="Calibri" w:cs="Calibri" w:eastAsia="Calibri" w:hAnsi="Calibri"/>
+          <w:color w:val="1A1A1A"/>
+          <w:sz w:val="20"/>
+          <w:szCs w:val="20"/>
+        </w:rPr>
+        <w:t xml:space="preserve">Inhlelo Consultants · MTN South Africa (via iOCO)</w:t>
+      </w:r>
+    </w:p>
+    <w:p>
+      <w:pPr>
+        <w:pStyle w:val="ListParagraph"/>
+        <w:numPr>
+          <w:ilvl w:val="0"/>
+          <w:numId w:val="1"/>
+        </w:numPr>
+        <w:spacing w:after="30"/>
+        <w:jc w:val="both"/>
+      </w:pPr>
+      <w:r>
+        <w:rPr>
+          <w:rFonts w:ascii="Calibri" w:cs="Calibri" w:eastAsia="Calibri" w:hAnsi="Calibri"/>
+          <w:color w:val="000000"/>
+          <w:sz w:val="20"/>
+          <w:szCs w:val="20"/>
+        </w:rPr>
+        <w:t xml:space="preserve">Delivered CI/CD and cloud automation for the MTN SA NextGen App with the iOCO client team and served as on-call DevOps support.</w:t>
+      </w:r>
+    </w:p>
+    <w:p>
+      <w:pPr>
+        <w:pStyle w:val="ListParagraph"/>
+        <w:numPr>
+          <w:ilvl w:val="0"/>
+          <w:numId w:val="1"/>
+        </w:numPr>
+        <w:spacing w:after="30"/>
+        <w:jc w:val="both"/>
+      </w:pPr>
+      <w:r>
+        <w:rPr>
+          <w:rFonts w:ascii="Calibri" w:cs="Calibri" w:eastAsia="Calibri" w:hAnsi="Calibri"/>
+          <w:color w:val="000000"/>
           <w:sz w:val="20"/>
           <w:szCs w:val="20"/>
         </w:rPr>
@@ -490,11 +500,12 @@
           <w:numId w:val="1"/>
         </w:numPr>
         <w:spacing w:after="30"/>
-      </w:pPr>
-      <w:r>
-        <w:rPr>
-          <w:rFonts w:ascii="Calibri" w:cs="Calibri" w:eastAsia="Calibri" w:hAnsi="Calibri"/>
-          <w:color w:val="1A231C"/>
+        <w:jc w:val="both"/>
+      </w:pPr>
+      <w:r>
+        <w:rPr>
+          <w:rFonts w:ascii="Calibri" w:cs="Calibri" w:eastAsia="Calibri" w:hAnsi="Calibri"/>
+          <w:color w:val="000000"/>
           <w:sz w:val="20"/>
           <w:szCs w:val="20"/>
         </w:rPr>
@@ -503,29 +514,20 @@
     </w:p>
     <w:p>
       <w:pPr>
-        <w:spacing w:after="10" w:before="120"/>
-      </w:pPr>
-      <w:r>
-        <w:rPr>
-          <w:rFonts w:ascii="Calibri" w:cs="Calibri" w:eastAsia="Calibri" w:hAnsi="Calibri"/>
-          <w:b/>
-          <w:bCs/>
-          <w:color w:val="1A231C"/>
+        <w:spacing w:after="6" w:before="120"/>
+      </w:pPr>
+      <w:r>
+        <w:rPr>
+          <w:rFonts w:ascii="Calibri" w:cs="Calibri" w:eastAsia="Calibri" w:hAnsi="Calibri"/>
+          <w:b/>
+          <w:bCs/>
+          <w:color w:val="000000"/>
           <w:sz w:val="21"/>
           <w:szCs w:val="21"/>
         </w:rPr>
         <w:t xml:space="preserve">DevOps Engineer</w:t>
       </w:r>
       <w:r>
-        <w:rPr>
-          <w:rFonts w:ascii="Calibri" w:cs="Calibri" w:eastAsia="Calibri" w:hAnsi="Calibri"/>
-          <w:color w:val="0E8A68"/>
-          <w:sz w:val="20"/>
-          <w:szCs w:val="20"/>
-        </w:rPr>
-        <w:t xml:space="preserve">   Inhlelo Consultants · Standard Bank (via iOCO)</w:t>
-      </w:r>
-      <w:r>
         <w:ptab w:alignment="right" w:relativeTo="margin" w:leader="none"/>
       </w:r>
       <w:r>
@@ -533,7 +535,7 @@
           <w:rFonts w:ascii="Calibri" w:cs="Calibri" w:eastAsia="Calibri" w:hAnsi="Calibri"/>
           <w:i/>
           <w:iCs/>
-          <w:color w:val="51665A"/>
+          <w:color w:val="3F3F3F"/>
           <w:sz w:val="18"/>
           <w:szCs w:val="18"/>
         </w:rPr>
@@ -542,17 +544,32 @@
     </w:p>
     <w:p>
       <w:pPr>
-        <w:pStyle w:val="ListParagraph"/>
-        <w:numPr>
-          <w:ilvl w:val="0"/>
-          <w:numId w:val="1"/>
-        </w:numPr>
-        <w:spacing w:after="30"/>
-      </w:pPr>
-      <w:r>
-        <w:rPr>
-          <w:rFonts w:ascii="Calibri" w:cs="Calibri" w:eastAsia="Calibri" w:hAnsi="Calibri"/>
-          <w:color w:val="1A231C"/>
+        <w:spacing w:after="10"/>
+      </w:pPr>
+      <w:r>
+        <w:rPr>
+          <w:rFonts w:ascii="Calibri" w:cs="Calibri" w:eastAsia="Calibri" w:hAnsi="Calibri"/>
+          <w:color w:val="1A1A1A"/>
+          <w:sz w:val="20"/>
+          <w:szCs w:val="20"/>
+        </w:rPr>
+        <w:t xml:space="preserve">Inhlelo Consultants · Standard Bank (via iOCO)</w:t>
+      </w:r>
+    </w:p>
+    <w:p>
+      <w:pPr>
+        <w:pStyle w:val="ListParagraph"/>
+        <w:numPr>
+          <w:ilvl w:val="0"/>
+          <w:numId w:val="1"/>
+        </w:numPr>
+        <w:spacing w:after="30"/>
+        <w:jc w:val="both"/>
+      </w:pPr>
+      <w:r>
+        <w:rPr>
+          <w:rFonts w:ascii="Calibri" w:cs="Calibri" w:eastAsia="Calibri" w:hAnsi="Calibri"/>
+          <w:color w:val="000000"/>
           <w:sz w:val="20"/>
           <w:szCs w:val="20"/>
         </w:rPr>
@@ -567,11 +584,12 @@
           <w:numId w:val="1"/>
         </w:numPr>
         <w:spacing w:after="30"/>
-      </w:pPr>
-      <w:r>
-        <w:rPr>
-          <w:rFonts w:ascii="Calibri" w:cs="Calibri" w:eastAsia="Calibri" w:hAnsi="Calibri"/>
-          <w:color w:val="1A231C"/>
+        <w:jc w:val="both"/>
+      </w:pPr>
+      <w:r>
+        <w:rPr>
+          <w:rFonts w:ascii="Calibri" w:cs="Calibri" w:eastAsia="Calibri" w:hAnsi="Calibri"/>
+          <w:color w:val="000000"/>
           <w:sz w:val="20"/>
           <w:szCs w:val="20"/>
         </w:rPr>
@@ -580,29 +598,20 @@
     </w:p>
     <w:p>
       <w:pPr>
-        <w:spacing w:after="10" w:before="120"/>
-      </w:pPr>
-      <w:r>
-        <w:rPr>
-          <w:rFonts w:ascii="Calibri" w:cs="Calibri" w:eastAsia="Calibri" w:hAnsi="Calibri"/>
-          <w:b/>
-          <w:bCs/>
-          <w:color w:val="1A231C"/>
+        <w:spacing w:after="6" w:before="120"/>
+      </w:pPr>
+      <w:r>
+        <w:rPr>
+          <w:rFonts w:ascii="Calibri" w:cs="Calibri" w:eastAsia="Calibri" w:hAnsi="Calibri"/>
+          <w:b/>
+          <w:bCs/>
+          <w:color w:val="000000"/>
           <w:sz w:val="21"/>
           <w:szCs w:val="21"/>
         </w:rPr>
         <w:t xml:space="preserve">DevOps Engineer</w:t>
       </w:r>
       <w:r>
-        <w:rPr>
-          <w:rFonts w:ascii="Calibri" w:cs="Calibri" w:eastAsia="Calibri" w:hAnsi="Calibri"/>
-          <w:color w:val="0E8A68"/>
-          <w:sz w:val="20"/>
-          <w:szCs w:val="20"/>
-        </w:rPr>
-        <w:t xml:space="preserve">   Lecturio</w:t>
-      </w:r>
-      <w:r>
         <w:ptab w:alignment="right" w:relativeTo="margin" w:leader="none"/>
       </w:r>
       <w:r>
@@ -610,7 +619,7 @@
           <w:rFonts w:ascii="Calibri" w:cs="Calibri" w:eastAsia="Calibri" w:hAnsi="Calibri"/>
           <w:i/>
           <w:iCs/>
-          <w:color w:val="51665A"/>
+          <w:color w:val="3F3F3F"/>
           <w:sz w:val="18"/>
           <w:szCs w:val="18"/>
         </w:rPr>
@@ -619,17 +628,32 @@
     </w:p>
     <w:p>
       <w:pPr>
-        <w:pStyle w:val="ListParagraph"/>
-        <w:numPr>
-          <w:ilvl w:val="0"/>
-          <w:numId w:val="1"/>
-        </w:numPr>
-        <w:spacing w:after="30"/>
-      </w:pPr>
-      <w:r>
-        <w:rPr>
-          <w:rFonts w:ascii="Calibri" w:cs="Calibri" w:eastAsia="Calibri" w:hAnsi="Calibri"/>
-          <w:color w:val="1A231C"/>
+        <w:spacing w:after="10"/>
+      </w:pPr>
+      <w:r>
+        <w:rPr>
+          <w:rFonts w:ascii="Calibri" w:cs="Calibri" w:eastAsia="Calibri" w:hAnsi="Calibri"/>
+          <w:color w:val="1A1A1A"/>
+          <w:sz w:val="20"/>
+          <w:szCs w:val="20"/>
+        </w:rPr>
+        <w:t xml:space="preserve">Lecturio</w:t>
+      </w:r>
+    </w:p>
+    <w:p>
+      <w:pPr>
+        <w:pStyle w:val="ListParagraph"/>
+        <w:numPr>
+          <w:ilvl w:val="0"/>
+          <w:numId w:val="1"/>
+        </w:numPr>
+        <w:spacing w:after="30"/>
+        <w:jc w:val="both"/>
+      </w:pPr>
+      <w:r>
+        <w:rPr>
+          <w:rFonts w:ascii="Calibri" w:cs="Calibri" w:eastAsia="Calibri" w:hAnsi="Calibri"/>
+          <w:color w:val="000000"/>
           <w:sz w:val="20"/>
           <w:szCs w:val="20"/>
         </w:rPr>
@@ -644,42 +668,34 @@
           <w:numId w:val="1"/>
         </w:numPr>
         <w:spacing w:after="30"/>
-      </w:pPr>
-      <w:r>
-        <w:rPr>
-          <w:rFonts w:ascii="Calibri" w:cs="Calibri" w:eastAsia="Calibri" w:hAnsi="Calibri"/>
-          <w:color w:val="1A231C"/>
-          <w:sz w:val="20"/>
-          <w:szCs w:val="20"/>
-        </w:rPr>
-        <w:t xml:space="preserve">Defined alerting mechanisms via product instrumentation to catch behavior-affecting changes.</w:t>
-      </w:r>
-    </w:p>
-    <w:p>
-      <w:pPr>
-        <w:spacing w:after="10" w:before="120"/>
-      </w:pPr>
-      <w:r>
-        <w:rPr>
-          <w:rFonts w:ascii="Calibri" w:cs="Calibri" w:eastAsia="Calibri" w:hAnsi="Calibri"/>
-          <w:b/>
-          <w:bCs/>
-          <w:color w:val="1A231C"/>
+        <w:jc w:val="both"/>
+      </w:pPr>
+      <w:r>
+        <w:rPr>
+          <w:rFonts w:ascii="Calibri" w:cs="Calibri" w:eastAsia="Calibri" w:hAnsi="Calibri"/>
+          <w:color w:val="000000"/>
+          <w:sz w:val="20"/>
+          <w:szCs w:val="20"/>
+        </w:rPr>
+        <w:t xml:space="preserve">Defined alerting via product instrumentation to catch behavior-affecting changes.</w:t>
+      </w:r>
+    </w:p>
+    <w:p>
+      <w:pPr>
+        <w:spacing w:after="6" w:before="120"/>
+      </w:pPr>
+      <w:r>
+        <w:rPr>
+          <w:rFonts w:ascii="Calibri" w:cs="Calibri" w:eastAsia="Calibri" w:hAnsi="Calibri"/>
+          <w:b/>
+          <w:bCs/>
+          <w:color w:val="000000"/>
           <w:sz w:val="21"/>
           <w:szCs w:val="21"/>
         </w:rPr>
         <w:t xml:space="preserve">DevOps / Site Reliability Engineer</w:t>
       </w:r>
       <w:r>
-        <w:rPr>
-          <w:rFonts w:ascii="Calibri" w:cs="Calibri" w:eastAsia="Calibri" w:hAnsi="Calibri"/>
-          <w:color w:val="0E8A68"/>
-          <w:sz w:val="20"/>
-          <w:szCs w:val="20"/>
-        </w:rPr>
-        <w:t xml:space="preserve">   Occasio LLC</w:t>
-      </w:r>
-      <w:r>
         <w:ptab w:alignment="right" w:relativeTo="margin" w:leader="none"/>
       </w:r>
       <w:r>
@@ -687,7 +703,7 @@
           <w:rFonts w:ascii="Calibri" w:cs="Calibri" w:eastAsia="Calibri" w:hAnsi="Calibri"/>
           <w:i/>
           <w:iCs/>
-          <w:color w:val="51665A"/>
+          <w:color w:val="3F3F3F"/>
           <w:sz w:val="18"/>
           <w:szCs w:val="18"/>
         </w:rPr>
@@ -696,17 +712,32 @@
     </w:p>
     <w:p>
       <w:pPr>
-        <w:pStyle w:val="ListParagraph"/>
-        <w:numPr>
-          <w:ilvl w:val="0"/>
-          <w:numId w:val="1"/>
-        </w:numPr>
-        <w:spacing w:after="30"/>
-      </w:pPr>
-      <w:r>
-        <w:rPr>
-          <w:rFonts w:ascii="Calibri" w:cs="Calibri" w:eastAsia="Calibri" w:hAnsi="Calibri"/>
-          <w:color w:val="1A231C"/>
+        <w:spacing w:after="10"/>
+      </w:pPr>
+      <w:r>
+        <w:rPr>
+          <w:rFonts w:ascii="Calibri" w:cs="Calibri" w:eastAsia="Calibri" w:hAnsi="Calibri"/>
+          <w:color w:val="1A1A1A"/>
+          <w:sz w:val="20"/>
+          <w:szCs w:val="20"/>
+        </w:rPr>
+        <w:t xml:space="preserve">Occasio LLC</w:t>
+      </w:r>
+    </w:p>
+    <w:p>
+      <w:pPr>
+        <w:pStyle w:val="ListParagraph"/>
+        <w:numPr>
+          <w:ilvl w:val="0"/>
+          <w:numId w:val="1"/>
+        </w:numPr>
+        <w:spacing w:after="30"/>
+        <w:jc w:val="both"/>
+      </w:pPr>
+      <w:r>
+        <w:rPr>
+          <w:rFonts w:ascii="Calibri" w:cs="Calibri" w:eastAsia="Calibri" w:hAnsi="Calibri"/>
+          <w:color w:val="000000"/>
           <w:sz w:val="20"/>
           <w:szCs w:val="20"/>
         </w:rPr>
@@ -721,11 +752,12 @@
           <w:numId w:val="1"/>
         </w:numPr>
         <w:spacing w:after="30"/>
-      </w:pPr>
-      <w:r>
-        <w:rPr>
-          <w:rFonts w:ascii="Calibri" w:cs="Calibri" w:eastAsia="Calibri" w:hAnsi="Calibri"/>
-          <w:color w:val="1A231C"/>
+        <w:jc w:val="both"/>
+      </w:pPr>
+      <w:r>
+        <w:rPr>
+          <w:rFonts w:ascii="Calibri" w:cs="Calibri" w:eastAsia="Calibri" w:hAnsi="Calibri"/>
+          <w:color w:val="000000"/>
           <w:sz w:val="20"/>
           <w:szCs w:val="20"/>
         </w:rPr>
@@ -734,29 +766,20 @@
     </w:p>
     <w:p>
       <w:pPr>
-        <w:spacing w:after="10" w:before="120"/>
-      </w:pPr>
-      <w:r>
-        <w:rPr>
-          <w:rFonts w:ascii="Calibri" w:cs="Calibri" w:eastAsia="Calibri" w:hAnsi="Calibri"/>
-          <w:b/>
-          <w:bCs/>
-          <w:color w:val="1A231C"/>
+        <w:spacing w:after="6" w:before="120"/>
+      </w:pPr>
+      <w:r>
+        <w:rPr>
+          <w:rFonts w:ascii="Calibri" w:cs="Calibri" w:eastAsia="Calibri" w:hAnsi="Calibri"/>
+          <w:b/>
+          <w:bCs/>
+          <w:color w:val="000000"/>
           <w:sz w:val="21"/>
           <w:szCs w:val="21"/>
         </w:rPr>
         <w:t xml:space="preserve">DevOps Engineer</w:t>
       </w:r>
       <w:r>
-        <w:rPr>
-          <w:rFonts w:ascii="Calibri" w:cs="Calibri" w:eastAsia="Calibri" w:hAnsi="Calibri"/>
-          <w:color w:val="0E8A68"/>
-          <w:sz w:val="20"/>
-          <w:szCs w:val="20"/>
-        </w:rPr>
-        <w:t xml:space="preserve">   phpsandbox.io</w:t>
-      </w:r>
-      <w:r>
         <w:ptab w:alignment="right" w:relativeTo="margin" w:leader="none"/>
       </w:r>
       <w:r>
@@ -764,7 +787,7 @@
           <w:rFonts w:ascii="Calibri" w:cs="Calibri" w:eastAsia="Calibri" w:hAnsi="Calibri"/>
           <w:i/>
           <w:iCs/>
-          <w:color w:val="51665A"/>
+          <w:color w:val="3F3F3F"/>
           <w:sz w:val="18"/>
           <w:szCs w:val="18"/>
         </w:rPr>
@@ -773,17 +796,32 @@
     </w:p>
     <w:p>
       <w:pPr>
-        <w:pStyle w:val="ListParagraph"/>
-        <w:numPr>
-          <w:ilvl w:val="0"/>
-          <w:numId w:val="1"/>
-        </w:numPr>
-        <w:spacing w:after="30"/>
-      </w:pPr>
-      <w:r>
-        <w:rPr>
-          <w:rFonts w:ascii="Calibri" w:cs="Calibri" w:eastAsia="Calibri" w:hAnsi="Calibri"/>
-          <w:color w:val="1A231C"/>
+        <w:spacing w:after="10"/>
+      </w:pPr>
+      <w:r>
+        <w:rPr>
+          <w:rFonts w:ascii="Calibri" w:cs="Calibri" w:eastAsia="Calibri" w:hAnsi="Calibri"/>
+          <w:color w:val="1A1A1A"/>
+          <w:sz w:val="20"/>
+          <w:szCs w:val="20"/>
+        </w:rPr>
+        <w:t xml:space="preserve">phpsandbox.io</w:t>
+      </w:r>
+    </w:p>
+    <w:p>
+      <w:pPr>
+        <w:pStyle w:val="ListParagraph"/>
+        <w:numPr>
+          <w:ilvl w:val="0"/>
+          <w:numId w:val="1"/>
+        </w:numPr>
+        <w:spacing w:after="30"/>
+        <w:jc w:val="both"/>
+      </w:pPr>
+      <w:r>
+        <w:rPr>
+          <w:rFonts w:ascii="Calibri" w:cs="Calibri" w:eastAsia="Calibri" w:hAnsi="Calibri"/>
+          <w:color w:val="000000"/>
           <w:sz w:val="20"/>
           <w:szCs w:val="20"/>
         </w:rPr>
@@ -798,11 +836,12 @@
           <w:numId w:val="1"/>
         </w:numPr>
         <w:spacing w:after="30"/>
-      </w:pPr>
-      <w:r>
-        <w:rPr>
-          <w:rFonts w:ascii="Calibri" w:cs="Calibri" w:eastAsia="Calibri" w:hAnsi="Calibri"/>
-          <w:color w:val="1A231C"/>
+        <w:jc w:val="both"/>
+      </w:pPr>
+      <w:r>
+        <w:rPr>
+          <w:rFonts w:ascii="Calibri" w:cs="Calibri" w:eastAsia="Calibri" w:hAnsi="Calibri"/>
+          <w:color w:val="000000"/>
           <w:sz w:val="20"/>
           <w:szCs w:val="20"/>
         </w:rPr>
@@ -811,29 +850,20 @@
     </w:p>
     <w:p>
       <w:pPr>
-        <w:spacing w:after="10" w:before="120"/>
-      </w:pPr>
-      <w:r>
-        <w:rPr>
-          <w:rFonts w:ascii="Calibri" w:cs="Calibri" w:eastAsia="Calibri" w:hAnsi="Calibri"/>
-          <w:b/>
-          <w:bCs/>
-          <w:color w:val="1A231C"/>
+        <w:spacing w:after="6" w:before="120"/>
+      </w:pPr>
+      <w:r>
+        <w:rPr>
+          <w:rFonts w:ascii="Calibri" w:cs="Calibri" w:eastAsia="Calibri" w:hAnsi="Calibri"/>
+          <w:b/>
+          <w:bCs/>
+          <w:color w:val="000000"/>
           <w:sz w:val="21"/>
           <w:szCs w:val="21"/>
         </w:rPr>
         <w:t xml:space="preserve">DevOps Engineer</w:t>
       </w:r>
       <w:r>
-        <w:rPr>
-          <w:rFonts w:ascii="Calibri" w:cs="Calibri" w:eastAsia="Calibri" w:hAnsi="Calibri"/>
-          <w:color w:val="0E8A68"/>
-          <w:sz w:val="20"/>
-          <w:szCs w:val="20"/>
-        </w:rPr>
-        <w:t xml:space="preserve">   HNG</w:t>
-      </w:r>
-      <w:r>
         <w:ptab w:alignment="right" w:relativeTo="margin" w:leader="none"/>
       </w:r>
       <w:r>
@@ -841,7 +871,7 @@
           <w:rFonts w:ascii="Calibri" w:cs="Calibri" w:eastAsia="Calibri" w:hAnsi="Calibri"/>
           <w:i/>
           <w:iCs/>
-          <w:color w:val="51665A"/>
+          <w:color w:val="3F3F3F"/>
           <w:sz w:val="18"/>
           <w:szCs w:val="18"/>
         </w:rPr>
@@ -850,17 +880,32 @@
     </w:p>
     <w:p>
       <w:pPr>
-        <w:pStyle w:val="ListParagraph"/>
-        <w:numPr>
-          <w:ilvl w:val="0"/>
-          <w:numId w:val="1"/>
-        </w:numPr>
-        <w:spacing w:after="30"/>
-      </w:pPr>
-      <w:r>
-        <w:rPr>
-          <w:rFonts w:ascii="Calibri" w:cs="Calibri" w:eastAsia="Calibri" w:hAnsi="Calibri"/>
-          <w:color w:val="1A231C"/>
+        <w:spacing w:after="10"/>
+      </w:pPr>
+      <w:r>
+        <w:rPr>
+          <w:rFonts w:ascii="Calibri" w:cs="Calibri" w:eastAsia="Calibri" w:hAnsi="Calibri"/>
+          <w:color w:val="1A1A1A"/>
+          <w:sz w:val="20"/>
+          <w:szCs w:val="20"/>
+        </w:rPr>
+        <w:t xml:space="preserve">HNG</w:t>
+      </w:r>
+    </w:p>
+    <w:p>
+      <w:pPr>
+        <w:pStyle w:val="ListParagraph"/>
+        <w:numPr>
+          <w:ilvl w:val="0"/>
+          <w:numId w:val="1"/>
+        </w:numPr>
+        <w:spacing w:after="30"/>
+        <w:jc w:val="both"/>
+      </w:pPr>
+      <w:r>
+        <w:rPr>
+          <w:rFonts w:ascii="Calibri" w:cs="Calibri" w:eastAsia="Calibri" w:hAnsi="Calibri"/>
+          <w:color w:val="000000"/>
           <w:sz w:val="20"/>
           <w:szCs w:val="20"/>
         </w:rPr>
@@ -875,11 +920,12 @@
           <w:numId w:val="1"/>
         </w:numPr>
         <w:spacing w:after="30"/>
-      </w:pPr>
-      <w:r>
-        <w:rPr>
-          <w:rFonts w:ascii="Calibri" w:cs="Calibri" w:eastAsia="Calibri" w:hAnsi="Calibri"/>
-          <w:color w:val="1A231C"/>
+        <w:jc w:val="both"/>
+      </w:pPr>
+      <w:r>
+        <w:rPr>
+          <w:rFonts w:ascii="Calibri" w:cs="Calibri" w:eastAsia="Calibri" w:hAnsi="Calibri"/>
+          <w:color w:val="000000"/>
           <w:sz w:val="20"/>
           <w:szCs w:val="20"/>
         </w:rPr>
@@ -889,7 +935,7 @@
     <w:p>
       <w:pPr>
         <w:pBdr>
-          <w:bottom w:val="single" w:color="145C40" w:sz="6"/>
+          <w:bottom w:val="single" w:color="000000" w:sz="6"/>
         </w:pBdr>
         <w:spacing w:after="40" w:before="200"/>
       </w:pPr>
@@ -898,7 +944,7 @@
           <w:rFonts w:ascii="Calibri" w:cs="Calibri" w:eastAsia="Calibri" w:hAnsi="Calibri"/>
           <w:b/>
           <w:bCs/>
-          <w:color w:val="145C40"/>
+          <w:color w:val="000000"/>
           <w:spacing w:val="12"/>
           <w:sz w:val="21"/>
           <w:szCs w:val="21"/>
@@ -915,7 +961,7 @@
           <w:rFonts w:ascii="Calibri" w:cs="Calibri" w:eastAsia="Calibri" w:hAnsi="Calibri"/>
           <w:b/>
           <w:bCs/>
-          <w:color w:val="1A231C"/>
+          <w:color w:val="000000"/>
           <w:sz w:val="20"/>
           <w:szCs w:val="20"/>
         </w:rPr>
@@ -924,7 +970,7 @@
       <w:r>
         <w:rPr>
           <w:rFonts w:ascii="Calibri" w:cs="Calibri" w:eastAsia="Calibri" w:hAnsi="Calibri"/>
-          <w:color w:val="51665A"/>
+          <w:color w:val="3F3F3F"/>
           <w:sz w:val="19"/>
           <w:szCs w:val="19"/>
         </w:rPr>
@@ -938,7 +984,7 @@
           <w:rFonts w:ascii="Calibri" w:cs="Calibri" w:eastAsia="Calibri" w:hAnsi="Calibri"/>
           <w:i/>
           <w:iCs/>
-          <w:color w:val="51665A"/>
+          <w:color w:val="3F3F3F"/>
           <w:sz w:val="18"/>
           <w:szCs w:val="18"/>
         </w:rPr>
@@ -954,7 +1000,7 @@
           <w:rFonts w:ascii="Calibri" w:cs="Calibri" w:eastAsia="Calibri" w:hAnsi="Calibri"/>
           <w:b/>
           <w:bCs/>
-          <w:color w:val="1A231C"/>
+          <w:color w:val="000000"/>
           <w:sz w:val="20"/>
           <w:szCs w:val="20"/>
         </w:rPr>
@@ -963,7 +1009,7 @@
       <w:r>
         <w:rPr>
           <w:rFonts w:ascii="Calibri" w:cs="Calibri" w:eastAsia="Calibri" w:hAnsi="Calibri"/>
-          <w:color w:val="51665A"/>
+          <w:color w:val="3F3F3F"/>
           <w:sz w:val="19"/>
           <w:szCs w:val="19"/>
         </w:rPr>
@@ -977,7 +1023,7 @@
           <w:rFonts w:ascii="Calibri" w:cs="Calibri" w:eastAsia="Calibri" w:hAnsi="Calibri"/>
           <w:i/>
           <w:iCs/>
-          <w:color w:val="51665A"/>
+          <w:color w:val="3F3F3F"/>
           <w:sz w:val="18"/>
           <w:szCs w:val="18"/>
         </w:rPr>
@@ -993,7 +1039,7 @@
           <w:rFonts w:ascii="Calibri" w:cs="Calibri" w:eastAsia="Calibri" w:hAnsi="Calibri"/>
           <w:b/>
           <w:bCs/>
-          <w:color w:val="1A231C"/>
+          <w:color w:val="000000"/>
           <w:sz w:val="20"/>
           <w:szCs w:val="20"/>
         </w:rPr>
@@ -1002,7 +1048,7 @@
       <w:r>
         <w:rPr>
           <w:rFonts w:ascii="Calibri" w:cs="Calibri" w:eastAsia="Calibri" w:hAnsi="Calibri"/>
-          <w:color w:val="51665A"/>
+          <w:color w:val="3F3F3F"/>
           <w:sz w:val="19"/>
           <w:szCs w:val="19"/>
         </w:rPr>
@@ -1016,7 +1062,7 @@
           <w:rFonts w:ascii="Calibri" w:cs="Calibri" w:eastAsia="Calibri" w:hAnsi="Calibri"/>
           <w:i/>
           <w:iCs/>
-          <w:color w:val="51665A"/>
+          <w:color w:val="3F3F3F"/>
           <w:sz w:val="18"/>
           <w:szCs w:val="18"/>
         </w:rPr>
@@ -1026,7 +1072,7 @@
     <w:p>
       <w:pPr>
         <w:pBdr>
-          <w:bottom w:val="single" w:color="145C40" w:sz="6"/>
+          <w:bottom w:val="single" w:color="000000" w:sz="6"/>
         </w:pBdr>
         <w:spacing w:after="40" w:before="200"/>
       </w:pPr>
@@ -1035,7 +1081,7 @@
           <w:rFonts w:ascii="Calibri" w:cs="Calibri" w:eastAsia="Calibri" w:hAnsi="Calibri"/>
           <w:b/>
           <w:bCs/>
-          <w:color w:val="145C40"/>
+          <w:color w:val="000000"/>
           <w:spacing w:val="12"/>
           <w:sz w:val="21"/>
           <w:szCs w:val="21"/>
@@ -1050,14 +1096,15 @@
           <w:ilvl w:val="0"/>
           <w:numId w:val="1"/>
         </w:numPr>
-        <w:spacing w:after="18"/>
-      </w:pPr>
-      <w:r>
-        <w:rPr>
-          <w:rFonts w:ascii="Calibri" w:cs="Calibri" w:eastAsia="Calibri" w:hAnsi="Calibri"/>
-          <w:color w:val="1A231C"/>
-          <w:sz w:val="19"/>
-          <w:szCs w:val="19"/>
+        <w:spacing w:after="30"/>
+        <w:jc w:val="both"/>
+      </w:pPr>
+      <w:r>
+        <w:rPr>
+          <w:rFonts w:ascii="Calibri" w:cs="Calibri" w:eastAsia="Calibri" w:hAnsi="Calibri"/>
+          <w:color w:val="000000"/>
+          <w:sz w:val="20"/>
+          <w:szCs w:val="20"/>
         </w:rPr>
         <w:t xml:space="preserve">Azure Solutions Architect Expert (AZ-305), Microsoft, 2024</w:t>
       </w:r>
@@ -1069,14 +1116,15 @@
           <w:ilvl w:val="0"/>
           <w:numId w:val="1"/>
         </w:numPr>
-        <w:spacing w:after="18"/>
-      </w:pPr>
-      <w:r>
-        <w:rPr>
-          <w:rFonts w:ascii="Calibri" w:cs="Calibri" w:eastAsia="Calibri" w:hAnsi="Calibri"/>
-          <w:color w:val="1A231C"/>
-          <w:sz w:val="19"/>
-          <w:szCs w:val="19"/>
+        <w:spacing w:after="30"/>
+        <w:jc w:val="both"/>
+      </w:pPr>
+      <w:r>
+        <w:rPr>
+          <w:rFonts w:ascii="Calibri" w:cs="Calibri" w:eastAsia="Calibri" w:hAnsi="Calibri"/>
+          <w:color w:val="000000"/>
+          <w:sz w:val="20"/>
+          <w:szCs w:val="20"/>
         </w:rPr>
         <w:t xml:space="preserve">Azure Developer Associate (AZ-204), Microsoft, 2024</w:t>
       </w:r>
@@ -1088,14 +1136,15 @@
           <w:ilvl w:val="0"/>
           <w:numId w:val="1"/>
         </w:numPr>
-        <w:spacing w:after="18"/>
-      </w:pPr>
-      <w:r>
-        <w:rPr>
-          <w:rFonts w:ascii="Calibri" w:cs="Calibri" w:eastAsia="Calibri" w:hAnsi="Calibri"/>
-          <w:color w:val="1A231C"/>
-          <w:sz w:val="19"/>
-          <w:szCs w:val="19"/>
+        <w:spacing w:after="30"/>
+        <w:jc w:val="both"/>
+      </w:pPr>
+      <w:r>
+        <w:rPr>
+          <w:rFonts w:ascii="Calibri" w:cs="Calibri" w:eastAsia="Calibri" w:hAnsi="Calibri"/>
+          <w:color w:val="000000"/>
+          <w:sz w:val="20"/>
+          <w:szCs w:val="20"/>
         </w:rPr>
         <w:t xml:space="preserve">AWS Cloud Practitioner, Amazon Web Services, 2024</w:t>
       </w:r>
@@ -1107,14 +1156,15 @@
           <w:ilvl w:val="0"/>
           <w:numId w:val="1"/>
         </w:numPr>
-        <w:spacing w:after="18"/>
-      </w:pPr>
-      <w:r>
-        <w:rPr>
-          <w:rFonts w:ascii="Calibri" w:cs="Calibri" w:eastAsia="Calibri" w:hAnsi="Calibri"/>
-          <w:color w:val="1A231C"/>
-          <w:sz w:val="19"/>
-          <w:szCs w:val="19"/>
+        <w:spacing w:after="30"/>
+        <w:jc w:val="both"/>
+      </w:pPr>
+      <w:r>
+        <w:rPr>
+          <w:rFonts w:ascii="Calibri" w:cs="Calibri" w:eastAsia="Calibri" w:hAnsi="Calibri"/>
+          <w:color w:val="000000"/>
+          <w:sz w:val="20"/>
+          <w:szCs w:val="20"/>
         </w:rPr>
         <w:t xml:space="preserve">Certified Kubernetes Application Developer (CKAD), Linux Foundation, 2022</w:t>
       </w:r>
@@ -1126,14 +1176,15 @@
           <w:ilvl w:val="0"/>
           <w:numId w:val="1"/>
         </w:numPr>
-        <w:spacing w:after="18"/>
-      </w:pPr>
-      <w:r>
-        <w:rPr>
-          <w:rFonts w:ascii="Calibri" w:cs="Calibri" w:eastAsia="Calibri" w:hAnsi="Calibri"/>
-          <w:color w:val="1A231C"/>
-          <w:sz w:val="19"/>
-          <w:szCs w:val="19"/>
+        <w:spacing w:after="30"/>
+        <w:jc w:val="both"/>
+      </w:pPr>
+      <w:r>
+        <w:rPr>
+          <w:rFonts w:ascii="Calibri" w:cs="Calibri" w:eastAsia="Calibri" w:hAnsi="Calibri"/>
+          <w:color w:val="000000"/>
+          <w:sz w:val="20"/>
+          <w:szCs w:val="20"/>
         </w:rPr>
         <w:t xml:space="preserve">Azure Fundamentals (AZ-900), Microsoft, 2022</w:t>
       </w:r>
@@ -1145,14 +1196,15 @@
           <w:ilvl w:val="0"/>
           <w:numId w:val="1"/>
         </w:numPr>
-        <w:spacing w:after="18"/>
-      </w:pPr>
-      <w:r>
-        <w:rPr>
-          <w:rFonts w:ascii="Calibri" w:cs="Calibri" w:eastAsia="Calibri" w:hAnsi="Calibri"/>
-          <w:color w:val="1A231C"/>
-          <w:sz w:val="19"/>
-          <w:szCs w:val="19"/>
+        <w:spacing w:after="30"/>
+        <w:jc w:val="both"/>
+      </w:pPr>
+      <w:r>
+        <w:rPr>
+          <w:rFonts w:ascii="Calibri" w:cs="Calibri" w:eastAsia="Calibri" w:hAnsi="Calibri"/>
+          <w:color w:val="000000"/>
+          <w:sz w:val="20"/>
+          <w:szCs w:val="20"/>
         </w:rPr>
         <w:t xml:space="preserve">IT Automation with Python, Google / Coursera, 2022</w:t>
       </w:r>
@@ -1346,7 +1398,7 @@
     <w:rPrDefault>
       <w:rPr>
         <w:rFonts w:ascii="Calibri" w:cs="Calibri" w:eastAsia="Calibri" w:hAnsi="Calibri"/>
-        <w:color w:val="1A231C"/>
+        <w:color w:val="000000"/>
       </w:rPr>
     </w:rPrDefault>
     <w:pPrDefault/>

</xml_diff>